<commit_message>
Show institution and project names with their IDs, align entity labels (#192)
</commit_message>
<xml_diff>
--- a/elixir_dss/templates/submission/generate_submission_docx.docx
+++ b/elixir_dss/templates/submission/generate_submission_docx.docx
@@ -167,7 +167,7 @@
                 <w:color w:val="000000" w:themeColor="text1"/>
                 <w:sz w:val="18"/>
               </w:rPr>
-              <w:t>Reference Number</w:t>
+              <w:t>Reference number</w:t>
             </w:r>
             <w:r>
               <w:rPr>
@@ -305,7 +305,7 @@
                 <w:color w:val="000000" w:themeColor="text1"/>
                 <w:sz w:val="18"/>
               </w:rPr>
-              <w:t>Creation Date</w:t>
+              <w:t>Creation date</w:t>
             </w:r>
             <w:r>
               <w:rPr>
@@ -374,7 +374,7 @@
                 <w:b/>
                 <w:sz w:val="18"/>
               </w:rPr>
-              <w:t>Date of Finalisation:</w:t>
+              <w:t>Date of finalisation:</w:t>
             </w:r>
           </w:p>
         </w:tc>
@@ -489,7 +489,7 @@
               <w:rPr>
                 <w:sz w:val="18"/>
               </w:rPr>
-              <w:t>_accession</w:t>
+              <w:t>_label</w:t>
             </w:r>
             <w:proofErr w:type="spellEnd"/>
             <w:r>
@@ -523,7 +523,7 @@
                 <w:color w:val="000000" w:themeColor="text1"/>
                 <w:sz w:val="18"/>
               </w:rPr>
-              <w:t>Receiving Project</w:t>
+              <w:t>Receiving project</w:t>
             </w:r>
             <w:r>
               <w:rPr>
@@ -570,7 +570,7 @@
               <w:rPr>
                 <w:sz w:val="18"/>
               </w:rPr>
-              <w:t>_project_name</w:t>
+              <w:t>_project_label</w:t>
             </w:r>
             <w:proofErr w:type="spellEnd"/>
             <w:r>

</xml_diff>

<commit_message>
Answer use conditions with Yes / No / Not applicable / Not available
The use conditions of a dataset were on/off toggles, so an untouched one was
exported as No, and a No with a remark came out as "Yes | No". They are now
selects with an unset state, the exporter emits the chosen answer ("-" when
unset) and the remark on its own. Existing true answers become Yes, false
ones become unset.

Every condition now has a remark field: the project, research use, LCSB
storage time and access form conditions get one. The DOCX report puts every
remark on its own line under the answer.

Closes #202
</commit_message>
<xml_diff>
--- a/elixir_dss/templates/submission/generate_submission_docx.docx
+++ b/elixir_dss/templates/submission/generate_submission_docx.docx
@@ -2959,30 +2959,30 @@
               <w:rPr>
                 <w:sz w:val="18"/>
               </w:rPr>
-              <w:t>{{</w:t>
+              <w:t>{{dataset.uc_project_limited}}</w:t>
             </w:r>
             <w:proofErr w:type="spellStart"/>
             <w:proofErr w:type="gramStart"/>
-            <w:r>
-              <w:rPr>
-                <w:sz w:val="18"/>
-              </w:rPr>
-              <w:t>dataset.uc</w:t>
-            </w:r>
             <w:proofErr w:type="gramEnd"/>
-            <w:r>
-              <w:rPr>
-                <w:sz w:val="18"/>
-              </w:rPr>
-              <w:t>_project_limited</w:t>
-            </w:r>
             <w:proofErr w:type="spellEnd"/>
-            <w:r>
-              <w:rPr>
-                <w:sz w:val="18"/>
-              </w:rPr>
-              <w:t>}}</w:t>
-            </w:r>
+          </w:p>
+          <w:p>
+            <w:pPr>
+              <w:rPr>
+                <w:b/>
+                <w:sz w:val="18"/>
+              </w:rPr>
+            </w:pPr>
+            <w:r>
+              <w:rPr>
+                <w:sz w:val="18"/>
+              </w:rPr>
+              <w:t>{{dataset.uc_project_notes}}</w:t>
+            </w:r>
+            <w:proofErr w:type="spellStart"/>
+            <w:proofErr w:type="gramStart"/>
+            <w:proofErr w:type="gramEnd"/>
+            <w:proofErr w:type="spellEnd"/>
           </w:p>
         </w:tc>
       </w:tr>
@@ -3030,30 +3030,29 @@
               <w:rPr>
                 <w:sz w:val="18"/>
               </w:rPr>
-              <w:t>{{</w:t>
+              <w:t>{{dataset.uc_research_use_limited}}</w:t>
             </w:r>
             <w:proofErr w:type="spellStart"/>
             <w:proofErr w:type="gramStart"/>
-            <w:r>
-              <w:rPr>
-                <w:sz w:val="18"/>
-              </w:rPr>
-              <w:t>dataset.uc</w:t>
-            </w:r>
             <w:proofErr w:type="gramEnd"/>
-            <w:r>
-              <w:rPr>
-                <w:sz w:val="18"/>
-              </w:rPr>
-              <w:t>_research_use_limited</w:t>
-            </w:r>
             <w:proofErr w:type="spellEnd"/>
-            <w:r>
-              <w:rPr>
-                <w:sz w:val="18"/>
-              </w:rPr>
-              <w:t>}}</w:t>
-            </w:r>
+          </w:p>
+          <w:p>
+            <w:pPr>
+              <w:rPr>
+                <w:sz w:val="18"/>
+              </w:rPr>
+            </w:pPr>
+            <w:r>
+              <w:rPr>
+                <w:sz w:val="18"/>
+              </w:rPr>
+              <w:t>{{dataset.uc_research_use_notes}}</w:t>
+            </w:r>
+            <w:proofErr w:type="spellStart"/>
+            <w:proofErr w:type="gramStart"/>
+            <w:proofErr w:type="gramEnd"/>
+            <w:proofErr w:type="spellEnd"/>
           </w:p>
         </w:tc>
       </w:tr>
@@ -3101,52 +3100,37 @@
               <w:rPr>
                 <w:sz w:val="18"/>
               </w:rPr>
-              <w:t>{{</w:t>
+              <w:t>{{dataset.uc_research_area_restriction}}</w:t>
             </w:r>
             <w:proofErr w:type="spellStart"/>
             <w:proofErr w:type="gramStart"/>
-            <w:r>
-              <w:rPr>
-                <w:sz w:val="18"/>
-              </w:rPr>
-              <w:t>dataset.uc</w:t>
-            </w:r>
             <w:proofErr w:type="gramEnd"/>
-            <w:r>
-              <w:rPr>
-                <w:sz w:val="18"/>
-              </w:rPr>
-              <w:t>_research_area_restriction</w:t>
-            </w:r>
             <w:proofErr w:type="spellEnd"/>
-            <w:r>
-              <w:rPr>
-                <w:sz w:val="18"/>
-              </w:rPr>
-              <w:t>}} {{</w:t>
-            </w:r>
             <w:proofErr w:type="spellStart"/>
             <w:proofErr w:type="gramStart"/>
-            <w:r>
-              <w:rPr>
-                <w:sz w:val="18"/>
-              </w:rPr>
-              <w:t>dataset.uc</w:t>
-            </w:r>
             <w:proofErr w:type="gramEnd"/>
-            <w:r>
-              <w:rPr>
-                <w:sz w:val="18"/>
-              </w:rPr>
-              <w:t>_research_area_notes</w:t>
-            </w:r>
             <w:proofErr w:type="spellEnd"/>
-            <w:r>
-              <w:rPr>
-                <w:sz w:val="18"/>
-              </w:rPr>
-              <w:t>}}</w:t>
-            </w:r>
+          </w:p>
+          <w:p>
+            <w:pPr>
+              <w:rPr>
+                <w:sz w:val="18"/>
+              </w:rPr>
+            </w:pPr>
+            <w:r>
+              <w:rPr>
+                <w:sz w:val="18"/>
+              </w:rPr>
+              <w:t>{{dataset.uc_research_area_notes}}</w:t>
+            </w:r>
+            <w:proofErr w:type="spellStart"/>
+            <w:proofErr w:type="gramStart"/>
+            <w:proofErr w:type="gramEnd"/>
+            <w:proofErr w:type="spellEnd"/>
+            <w:proofErr w:type="spellStart"/>
+            <w:proofErr w:type="gramStart"/>
+            <w:proofErr w:type="gramEnd"/>
+            <w:proofErr w:type="spellEnd"/>
           </w:p>
         </w:tc>
       </w:tr>
@@ -3194,52 +3178,37 @@
               <w:rPr>
                 <w:sz w:val="18"/>
               </w:rPr>
-              <w:t>{{</w:t>
+              <w:t>{{dataset.uc_geographic_restriction}}</w:t>
             </w:r>
             <w:proofErr w:type="spellStart"/>
             <w:proofErr w:type="gramStart"/>
-            <w:r>
-              <w:rPr>
-                <w:sz w:val="18"/>
-              </w:rPr>
-              <w:t>dataset.uc</w:t>
-            </w:r>
             <w:proofErr w:type="gramEnd"/>
-            <w:r>
-              <w:rPr>
-                <w:sz w:val="18"/>
-              </w:rPr>
-              <w:t>_geographic_restriction</w:t>
-            </w:r>
             <w:proofErr w:type="spellEnd"/>
-            <w:r>
-              <w:rPr>
-                <w:sz w:val="18"/>
-              </w:rPr>
-              <w:t>}} {{</w:t>
-            </w:r>
             <w:proofErr w:type="spellStart"/>
             <w:proofErr w:type="gramStart"/>
-            <w:r>
-              <w:rPr>
-                <w:sz w:val="18"/>
-              </w:rPr>
-              <w:t>dataset.uc</w:t>
-            </w:r>
             <w:proofErr w:type="gramEnd"/>
-            <w:r>
-              <w:rPr>
-                <w:sz w:val="18"/>
-              </w:rPr>
-              <w:t>_geographic_notes</w:t>
-            </w:r>
             <w:proofErr w:type="spellEnd"/>
-            <w:r>
-              <w:rPr>
-                <w:sz w:val="18"/>
-              </w:rPr>
-              <w:t>}}</w:t>
-            </w:r>
+          </w:p>
+          <w:p>
+            <w:pPr>
+              <w:rPr>
+                <w:sz w:val="18"/>
+              </w:rPr>
+            </w:pPr>
+            <w:r>
+              <w:rPr>
+                <w:sz w:val="18"/>
+              </w:rPr>
+              <w:t>{{dataset.uc_geographic_notes}}</w:t>
+            </w:r>
+            <w:proofErr w:type="spellStart"/>
+            <w:proofErr w:type="gramStart"/>
+            <w:proofErr w:type="gramEnd"/>
+            <w:proofErr w:type="spellEnd"/>
+            <w:proofErr w:type="spellStart"/>
+            <w:proofErr w:type="gramStart"/>
+            <w:proofErr w:type="gramEnd"/>
+            <w:proofErr w:type="spellEnd"/>
           </w:p>
         </w:tc>
       </w:tr>
@@ -3287,52 +3256,37 @@
               <w:rPr>
                 <w:sz w:val="18"/>
               </w:rPr>
-              <w:t>{{</w:t>
+              <w:t>{{dataset.uc_recipient_type_restriction}}</w:t>
             </w:r>
             <w:proofErr w:type="spellStart"/>
             <w:proofErr w:type="gramStart"/>
-            <w:r>
-              <w:rPr>
-                <w:sz w:val="18"/>
-              </w:rPr>
-              <w:t>dataset.uc</w:t>
-            </w:r>
             <w:proofErr w:type="gramEnd"/>
-            <w:r>
-              <w:rPr>
-                <w:sz w:val="18"/>
-              </w:rPr>
-              <w:t>_recipient_type_restriction</w:t>
-            </w:r>
             <w:proofErr w:type="spellEnd"/>
-            <w:r>
-              <w:rPr>
-                <w:sz w:val="18"/>
-              </w:rPr>
-              <w:t>}} {{</w:t>
-            </w:r>
             <w:proofErr w:type="spellStart"/>
             <w:proofErr w:type="gramStart"/>
-            <w:r>
-              <w:rPr>
-                <w:sz w:val="18"/>
-              </w:rPr>
-              <w:t>dataset.uc</w:t>
-            </w:r>
             <w:proofErr w:type="gramEnd"/>
-            <w:r>
-              <w:rPr>
-                <w:sz w:val="18"/>
-              </w:rPr>
-              <w:t>_recipient_type_notes</w:t>
-            </w:r>
             <w:proofErr w:type="spellEnd"/>
-            <w:r>
-              <w:rPr>
-                <w:sz w:val="18"/>
-              </w:rPr>
-              <w:t>}}</w:t>
-            </w:r>
+          </w:p>
+          <w:p>
+            <w:pPr>
+              <w:rPr>
+                <w:sz w:val="18"/>
+              </w:rPr>
+            </w:pPr>
+            <w:r>
+              <w:rPr>
+                <w:sz w:val="18"/>
+              </w:rPr>
+              <w:t>{{dataset.uc_recipient_type_notes}}</w:t>
+            </w:r>
+            <w:proofErr w:type="spellStart"/>
+            <w:proofErr w:type="gramStart"/>
+            <w:proofErr w:type="gramEnd"/>
+            <w:proofErr w:type="spellEnd"/>
+            <w:proofErr w:type="spellStart"/>
+            <w:proofErr w:type="gramStart"/>
+            <w:proofErr w:type="gramEnd"/>
+            <w:proofErr w:type="spellEnd"/>
           </w:p>
         </w:tc>
       </w:tr>
@@ -3380,52 +3334,37 @@
               <w:rPr>
                 <w:sz w:val="18"/>
               </w:rPr>
-              <w:t>{{</w:t>
+              <w:t>{{dataset.uc_user_restriction}}</w:t>
             </w:r>
             <w:proofErr w:type="spellStart"/>
             <w:proofErr w:type="gramStart"/>
-            <w:r>
-              <w:rPr>
-                <w:sz w:val="18"/>
-              </w:rPr>
-              <w:t>dataset.uc</w:t>
-            </w:r>
             <w:proofErr w:type="gramEnd"/>
-            <w:r>
-              <w:rPr>
-                <w:sz w:val="18"/>
-              </w:rPr>
-              <w:t>_user_restriction</w:t>
-            </w:r>
             <w:proofErr w:type="spellEnd"/>
-            <w:r>
-              <w:rPr>
-                <w:sz w:val="18"/>
-              </w:rPr>
-              <w:t>}} {{</w:t>
-            </w:r>
             <w:proofErr w:type="spellStart"/>
             <w:proofErr w:type="gramStart"/>
-            <w:r>
-              <w:rPr>
-                <w:sz w:val="18"/>
-              </w:rPr>
-              <w:t>dataset.uc</w:t>
-            </w:r>
             <w:proofErr w:type="gramEnd"/>
-            <w:r>
-              <w:rPr>
-                <w:sz w:val="18"/>
-              </w:rPr>
-              <w:t>_user_notes</w:t>
-            </w:r>
             <w:proofErr w:type="spellEnd"/>
-            <w:r>
-              <w:rPr>
-                <w:sz w:val="18"/>
-              </w:rPr>
-              <w:t>}}</w:t>
-            </w:r>
+          </w:p>
+          <w:p>
+            <w:pPr>
+              <w:rPr>
+                <w:sz w:val="18"/>
+              </w:rPr>
+            </w:pPr>
+            <w:r>
+              <w:rPr>
+                <w:sz w:val="18"/>
+              </w:rPr>
+              <w:t>{{dataset.uc_user_notes}}</w:t>
+            </w:r>
+            <w:proofErr w:type="spellStart"/>
+            <w:proofErr w:type="gramStart"/>
+            <w:proofErr w:type="gramEnd"/>
+            <w:proofErr w:type="spellEnd"/>
+            <w:proofErr w:type="spellStart"/>
+            <w:proofErr w:type="gramStart"/>
+            <w:proofErr w:type="gramEnd"/>
+            <w:proofErr w:type="spellEnd"/>
           </w:p>
         </w:tc>
       </w:tr>
@@ -3474,52 +3413,37 @@
               <w:rPr>
                 <w:sz w:val="18"/>
               </w:rPr>
-              <w:t>{{</w:t>
+              <w:t>{{dataset.uc_publication_restriction}}</w:t>
             </w:r>
             <w:proofErr w:type="spellStart"/>
             <w:proofErr w:type="gramStart"/>
-            <w:r>
-              <w:rPr>
-                <w:sz w:val="18"/>
-              </w:rPr>
-              <w:t>dataset.uc</w:t>
-            </w:r>
             <w:proofErr w:type="gramEnd"/>
-            <w:r>
-              <w:rPr>
-                <w:sz w:val="18"/>
-              </w:rPr>
-              <w:t>_publication_restriction</w:t>
-            </w:r>
             <w:proofErr w:type="spellEnd"/>
-            <w:r>
-              <w:rPr>
-                <w:sz w:val="18"/>
-              </w:rPr>
-              <w:t>}} {{</w:t>
-            </w:r>
             <w:proofErr w:type="spellStart"/>
             <w:proofErr w:type="gramStart"/>
-            <w:r>
-              <w:rPr>
-                <w:sz w:val="18"/>
-              </w:rPr>
-              <w:t>dataset.uc</w:t>
-            </w:r>
             <w:proofErr w:type="gramEnd"/>
-            <w:r>
-              <w:rPr>
-                <w:sz w:val="18"/>
-              </w:rPr>
-              <w:t>_publication_notes</w:t>
-            </w:r>
             <w:proofErr w:type="spellEnd"/>
-            <w:r>
-              <w:rPr>
-                <w:sz w:val="18"/>
-              </w:rPr>
-              <w:t>}}</w:t>
-            </w:r>
+          </w:p>
+          <w:p>
+            <w:pPr>
+              <w:rPr>
+                <w:sz w:val="18"/>
+              </w:rPr>
+            </w:pPr>
+            <w:r>
+              <w:rPr>
+                <w:sz w:val="18"/>
+              </w:rPr>
+              <w:t>{{dataset.uc_publication_notes}}</w:t>
+            </w:r>
+            <w:proofErr w:type="spellStart"/>
+            <w:proofErr w:type="gramStart"/>
+            <w:proofErr w:type="gramEnd"/>
+            <w:proofErr w:type="spellEnd"/>
+            <w:proofErr w:type="spellStart"/>
+            <w:proofErr w:type="gramStart"/>
+            <w:proofErr w:type="gramEnd"/>
+            <w:proofErr w:type="spellEnd"/>
           </w:p>
         </w:tc>
       </w:tr>
@@ -3567,52 +3491,37 @@
               <w:rPr>
                 <w:sz w:val="18"/>
               </w:rPr>
-              <w:t>{{</w:t>
+              <w:t>{{dataset.uc_time_restriction}}</w:t>
             </w:r>
             <w:proofErr w:type="spellStart"/>
             <w:proofErr w:type="gramStart"/>
-            <w:r>
-              <w:rPr>
-                <w:sz w:val="18"/>
-              </w:rPr>
-              <w:t>dataset.uc</w:t>
-            </w:r>
             <w:proofErr w:type="gramEnd"/>
-            <w:r>
-              <w:rPr>
-                <w:sz w:val="18"/>
-              </w:rPr>
-              <w:t>_time_restriction</w:t>
-            </w:r>
             <w:proofErr w:type="spellEnd"/>
-            <w:r>
-              <w:rPr>
-                <w:sz w:val="18"/>
-              </w:rPr>
-              <w:t>}} {{</w:t>
-            </w:r>
             <w:proofErr w:type="spellStart"/>
             <w:proofErr w:type="gramStart"/>
-            <w:r>
-              <w:rPr>
-                <w:sz w:val="18"/>
-              </w:rPr>
-              <w:t>dataset.uc</w:t>
-            </w:r>
             <w:proofErr w:type="gramEnd"/>
-            <w:r>
-              <w:rPr>
-                <w:sz w:val="18"/>
-              </w:rPr>
-              <w:t>_time_notes</w:t>
-            </w:r>
             <w:proofErr w:type="spellEnd"/>
-            <w:r>
-              <w:rPr>
-                <w:sz w:val="18"/>
-              </w:rPr>
-              <w:t>}}</w:t>
-            </w:r>
+          </w:p>
+          <w:p>
+            <w:pPr>
+              <w:rPr>
+                <w:sz w:val="18"/>
+              </w:rPr>
+            </w:pPr>
+            <w:r>
+              <w:rPr>
+                <w:sz w:val="18"/>
+              </w:rPr>
+              <w:t>{{dataset.uc_time_notes}}</w:t>
+            </w:r>
+            <w:proofErr w:type="spellStart"/>
+            <w:proofErr w:type="gramStart"/>
+            <w:proofErr w:type="gramEnd"/>
+            <w:proofErr w:type="spellEnd"/>
+            <w:proofErr w:type="spellStart"/>
+            <w:proofErr w:type="gramStart"/>
+            <w:proofErr w:type="gramEnd"/>
+            <w:proofErr w:type="spellEnd"/>
           </w:p>
         </w:tc>
       </w:tr>
@@ -3660,52 +3569,37 @@
               <w:rPr>
                 <w:sz w:val="18"/>
               </w:rPr>
-              <w:t>{{</w:t>
+              <w:t>{{dataset.uc_lcsb_time_restriction}} {{dataset.uc_lcsb_time_date}}</w:t>
             </w:r>
             <w:proofErr w:type="spellStart"/>
             <w:proofErr w:type="gramStart"/>
-            <w:r>
-              <w:rPr>
-                <w:sz w:val="18"/>
-              </w:rPr>
-              <w:t>dataset.uc</w:t>
-            </w:r>
             <w:proofErr w:type="gramEnd"/>
-            <w:r>
-              <w:rPr>
-                <w:sz w:val="18"/>
-              </w:rPr>
-              <w:t>_lcsb_time_restriction</w:t>
-            </w:r>
             <w:proofErr w:type="spellEnd"/>
-            <w:r>
-              <w:rPr>
-                <w:sz w:val="18"/>
-              </w:rPr>
-              <w:t>}} {{</w:t>
-            </w:r>
             <w:proofErr w:type="spellStart"/>
             <w:proofErr w:type="gramStart"/>
-            <w:r>
-              <w:rPr>
-                <w:sz w:val="18"/>
-              </w:rPr>
-              <w:t>dataset.uc</w:t>
-            </w:r>
             <w:proofErr w:type="gramEnd"/>
-            <w:r>
-              <w:rPr>
-                <w:sz w:val="18"/>
-              </w:rPr>
-              <w:t>_lcsb_time_date</w:t>
-            </w:r>
             <w:proofErr w:type="spellEnd"/>
-            <w:r>
-              <w:rPr>
-                <w:sz w:val="18"/>
-              </w:rPr>
-              <w:t>}}</w:t>
-            </w:r>
+          </w:p>
+          <w:p>
+            <w:pPr>
+              <w:rPr>
+                <w:sz w:val="18"/>
+              </w:rPr>
+            </w:pPr>
+            <w:r>
+              <w:rPr>
+                <w:sz w:val="18"/>
+              </w:rPr>
+              <w:t>{{dataset.uc_lcsb_time_notes}}</w:t>
+            </w:r>
+            <w:proofErr w:type="spellStart"/>
+            <w:proofErr w:type="gramStart"/>
+            <w:proofErr w:type="gramEnd"/>
+            <w:proofErr w:type="spellEnd"/>
+            <w:proofErr w:type="spellStart"/>
+            <w:proofErr w:type="gramStart"/>
+            <w:proofErr w:type="gramEnd"/>
+            <w:proofErr w:type="spellEnd"/>
           </w:p>
         </w:tc>
       </w:tr>
@@ -3753,52 +3647,37 @@
               <w:rPr>
                 <w:sz w:val="18"/>
               </w:rPr>
-              <w:t>{{</w:t>
+              <w:t>{{dataset.uc_return_requirement}}</w:t>
             </w:r>
             <w:proofErr w:type="spellStart"/>
             <w:proofErr w:type="gramStart"/>
-            <w:r>
-              <w:rPr>
-                <w:sz w:val="18"/>
-              </w:rPr>
-              <w:t>dataset.uc</w:t>
-            </w:r>
             <w:proofErr w:type="gramEnd"/>
-            <w:r>
-              <w:rPr>
-                <w:sz w:val="18"/>
-              </w:rPr>
-              <w:t>_return_requirement</w:t>
-            </w:r>
             <w:proofErr w:type="spellEnd"/>
-            <w:r>
-              <w:rPr>
-                <w:sz w:val="18"/>
-              </w:rPr>
-              <w:t>}} {{</w:t>
-            </w:r>
             <w:proofErr w:type="spellStart"/>
             <w:proofErr w:type="gramStart"/>
-            <w:r>
-              <w:rPr>
-                <w:sz w:val="18"/>
-              </w:rPr>
-              <w:t>dataset.uc</w:t>
-            </w:r>
             <w:proofErr w:type="gramEnd"/>
-            <w:r>
-              <w:rPr>
-                <w:sz w:val="18"/>
-              </w:rPr>
-              <w:t>_return_notes</w:t>
-            </w:r>
             <w:proofErr w:type="spellEnd"/>
-            <w:r>
-              <w:rPr>
-                <w:sz w:val="18"/>
-              </w:rPr>
-              <w:t>}}</w:t>
-            </w:r>
+          </w:p>
+          <w:p>
+            <w:pPr>
+              <w:rPr>
+                <w:sz w:val="18"/>
+              </w:rPr>
+            </w:pPr>
+            <w:r>
+              <w:rPr>
+                <w:sz w:val="18"/>
+              </w:rPr>
+              <w:t>{{dataset.uc_return_notes}}</w:t>
+            </w:r>
+            <w:proofErr w:type="spellStart"/>
+            <w:proofErr w:type="gramStart"/>
+            <w:proofErr w:type="gramEnd"/>
+            <w:proofErr w:type="spellEnd"/>
+            <w:proofErr w:type="spellStart"/>
+            <w:proofErr w:type="gramStart"/>
+            <w:proofErr w:type="gramEnd"/>
+            <w:proofErr w:type="spellEnd"/>
           </w:p>
         </w:tc>
       </w:tr>
@@ -3846,52 +3725,37 @@
               <w:rPr>
                 <w:sz w:val="18"/>
               </w:rPr>
-              <w:t>{{</w:t>
+              <w:t>{{dataset.uc_ip_restriction}}</w:t>
             </w:r>
             <w:proofErr w:type="spellStart"/>
             <w:proofErr w:type="gramStart"/>
-            <w:r>
-              <w:rPr>
-                <w:sz w:val="18"/>
-              </w:rPr>
-              <w:t>dataset.uc</w:t>
-            </w:r>
             <w:proofErr w:type="gramEnd"/>
-            <w:r>
-              <w:rPr>
-                <w:sz w:val="18"/>
-              </w:rPr>
-              <w:t>_ip_restriction</w:t>
-            </w:r>
             <w:proofErr w:type="spellEnd"/>
-            <w:r>
-              <w:rPr>
-                <w:sz w:val="18"/>
-              </w:rPr>
-              <w:t>}} {{</w:t>
-            </w:r>
             <w:proofErr w:type="spellStart"/>
             <w:proofErr w:type="gramStart"/>
-            <w:r>
-              <w:rPr>
-                <w:sz w:val="18"/>
-              </w:rPr>
-              <w:t>dataset.uc</w:t>
-            </w:r>
             <w:proofErr w:type="gramEnd"/>
-            <w:r>
-              <w:rPr>
-                <w:sz w:val="18"/>
-              </w:rPr>
-              <w:t>_ip_notes</w:t>
-            </w:r>
             <w:proofErr w:type="spellEnd"/>
-            <w:r>
-              <w:rPr>
-                <w:sz w:val="18"/>
-              </w:rPr>
-              <w:t>}}</w:t>
-            </w:r>
+          </w:p>
+          <w:p>
+            <w:pPr>
+              <w:rPr>
+                <w:sz w:val="18"/>
+              </w:rPr>
+            </w:pPr>
+            <w:r>
+              <w:rPr>
+                <w:sz w:val="18"/>
+              </w:rPr>
+              <w:t>{{dataset.uc_ip_notes}}</w:t>
+            </w:r>
+            <w:proofErr w:type="spellStart"/>
+            <w:proofErr w:type="gramStart"/>
+            <w:proofErr w:type="gramEnd"/>
+            <w:proofErr w:type="spellEnd"/>
+            <w:proofErr w:type="spellStart"/>
+            <w:proofErr w:type="gramStart"/>
+            <w:proofErr w:type="gramEnd"/>
+            <w:proofErr w:type="spellEnd"/>
           </w:p>
         </w:tc>
       </w:tr>
@@ -3939,52 +3803,37 @@
               <w:rPr>
                 <w:sz w:val="18"/>
               </w:rPr>
-              <w:t>{{</w:t>
+              <w:t>{{dataset.uc_dac_required}}</w:t>
             </w:r>
             <w:proofErr w:type="spellStart"/>
             <w:proofErr w:type="gramStart"/>
-            <w:r>
-              <w:rPr>
-                <w:sz w:val="18"/>
-              </w:rPr>
-              <w:t>dataset.uc</w:t>
-            </w:r>
             <w:proofErr w:type="gramEnd"/>
-            <w:r>
-              <w:rPr>
-                <w:sz w:val="18"/>
-              </w:rPr>
-              <w:t>_dac_required</w:t>
-            </w:r>
             <w:proofErr w:type="spellEnd"/>
-            <w:r>
-              <w:rPr>
-                <w:sz w:val="18"/>
-              </w:rPr>
-              <w:t>}} {{</w:t>
-            </w:r>
             <w:proofErr w:type="spellStart"/>
             <w:proofErr w:type="gramStart"/>
-            <w:r>
-              <w:rPr>
-                <w:sz w:val="18"/>
-              </w:rPr>
-              <w:t>dataset.uc</w:t>
-            </w:r>
             <w:proofErr w:type="gramEnd"/>
-            <w:r>
-              <w:rPr>
-                <w:sz w:val="18"/>
-              </w:rPr>
-              <w:t>_dac_notes</w:t>
-            </w:r>
             <w:proofErr w:type="spellEnd"/>
-            <w:r>
-              <w:rPr>
-                <w:sz w:val="18"/>
-              </w:rPr>
-              <w:t>}}</w:t>
-            </w:r>
+          </w:p>
+          <w:p>
+            <w:pPr>
+              <w:rPr>
+                <w:sz w:val="18"/>
+              </w:rPr>
+            </w:pPr>
+            <w:r>
+              <w:rPr>
+                <w:sz w:val="18"/>
+              </w:rPr>
+              <w:t>{{dataset.uc_dac_notes}}</w:t>
+            </w:r>
+            <w:proofErr w:type="spellStart"/>
+            <w:proofErr w:type="gramStart"/>
+            <w:proofErr w:type="gramEnd"/>
+            <w:proofErr w:type="spellEnd"/>
+            <w:proofErr w:type="spellStart"/>
+            <w:proofErr w:type="gramStart"/>
+            <w:proofErr w:type="gramEnd"/>
+            <w:proofErr w:type="spellEnd"/>
           </w:p>
         </w:tc>
       </w:tr>
@@ -4032,30 +3881,29 @@
               <w:rPr>
                 <w:sz w:val="18"/>
               </w:rPr>
-              <w:t>{{</w:t>
+              <w:t>{{dataset.uc_access_form_required}}</w:t>
             </w:r>
             <w:proofErr w:type="spellStart"/>
             <w:proofErr w:type="gramStart"/>
-            <w:r>
-              <w:rPr>
-                <w:sz w:val="18"/>
-              </w:rPr>
-              <w:t>dataset.uc</w:t>
-            </w:r>
             <w:proofErr w:type="gramEnd"/>
-            <w:r>
-              <w:rPr>
-                <w:sz w:val="18"/>
-              </w:rPr>
-              <w:t>_access_form_required</w:t>
-            </w:r>
             <w:proofErr w:type="spellEnd"/>
-            <w:r>
-              <w:rPr>
-                <w:sz w:val="18"/>
-              </w:rPr>
-              <w:t>}}</w:t>
-            </w:r>
+          </w:p>
+          <w:p>
+            <w:pPr>
+              <w:rPr>
+                <w:sz w:val="18"/>
+              </w:rPr>
+            </w:pPr>
+            <w:r>
+              <w:rPr>
+                <w:sz w:val="18"/>
+              </w:rPr>
+              <w:t>{{dataset.uc_access_form_notes}}</w:t>
+            </w:r>
+            <w:proofErr w:type="spellStart"/>
+            <w:proofErr w:type="gramStart"/>
+            <w:proofErr w:type="gramEnd"/>
+            <w:proofErr w:type="spellEnd"/>
           </w:p>
         </w:tc>
       </w:tr>

</xml_diff>

<commit_message>
Rename user fields to Submitters and Recipients
</commit_message>
<xml_diff>
--- a/elixir_dss/templates/submission/generate_submission_docx.docx
+++ b/elixir_dss/templates/submission/generate_submission_docx.docx
@@ -607,7 +607,7 @@
                 <w:color w:val="000000" w:themeColor="text1"/>
                 <w:sz w:val="18"/>
               </w:rPr>
-              <w:t>Submitting user(s):</w:t>
+              <w:t>Submitters:</w:t>
             </w:r>
           </w:p>
         </w:tc>
@@ -685,7 +685,7 @@
                 <w:b/>
                 <w:sz w:val="18"/>
               </w:rPr>
-              <w:t>Recipient user(s):</w:t>
+              <w:t>Recipients:</w:t>
             </w:r>
           </w:p>
         </w:tc>

</xml_diff>

<commit_message>
Record an ORCID iD for dataset creators
</commit_message>
<xml_diff>
--- a/elixir_dss/templates/submission/generate_submission_docx.docx
+++ b/elixir_dss/templates/submission/generate_submission_docx.docx
@@ -1759,6 +1759,89 @@
                 <w:sz w:val="18"/>
               </w:rPr>
               <w:t>}}</w:t>
+            </w:r>
+          </w:p>
+        </w:tc>
+      </w:tr>
+      <w:tr>
+        <w:tc>
+          <w:tcPr>
+            <w:tcW w:w="2414" w:type="dxa"/>
+            <w:shd w:val="clear" w:color="auto" w:fill="E7E6E6" w:themeFill="background2"/>
+            <w:tcMar>
+              <w:top w:w="30" w:type="dxa"/>
+              <w:left w:w="70" w:type="dxa"/>
+              <w:bottom w:w="30" w:type="dxa"/>
+              <w:right w:w="70" w:type="dxa"/>
+            </w:tcMar>
+          </w:tcPr>
+          <w:p>
+            <w:r>
+              <w:rPr>
+                <w:b/>
+                <w:sz w:val="18"/>
+              </w:rPr>
+              <w:t>Creators</w:t>
+            </w:r>
+          </w:p>
+        </w:tc>
+        <w:tc>
+          <w:tcPr>
+            <w:tcW w:w="7794" w:type="dxa"/>
+            <w:gridSpan w:val="4"/>
+            <w:tcMar>
+              <w:top w:w="30" w:type="dxa"/>
+              <w:left w:w="70" w:type="dxa"/>
+              <w:bottom w:w="30" w:type="dxa"/>
+              <w:right w:w="70" w:type="dxa"/>
+            </w:tcMar>
+          </w:tcPr>
+          <w:p>
+            <w:r>
+              <w:rPr>
+                <w:sz w:val="18"/>
+              </w:rPr>
+              <w:t xml:space="preserve">{%p for creator in dataset.creators %}</w:t>
+            </w:r>
+          </w:p>
+          <w:p>
+            <w:r>
+              <w:rPr>
+                <w:sz w:val="18"/>
+              </w:rPr>
+              <w:t xml:space="preserve">{{creator.first_name}} {{creator.last_name}}, {{creator.email}}, {{creator.institution}}, {{creator.role}}{% if creator.orcid != '-' %}, ORCID iD {{creator.orcid}}{% endif %}</w:t>
+            </w:r>
+          </w:p>
+          <w:p>
+            <w:r>
+              <w:rPr>
+                <w:sz w:val="18"/>
+              </w:rPr>
+              <w:t xml:space="preserve">{%p endfor %}</w:t>
+            </w:r>
+          </w:p>
+          <w:p>
+            <w:r>
+              <w:rPr>
+                <w:sz w:val="18"/>
+              </w:rPr>
+              <w:t xml:space="preserve">{%p if not dataset.creators %}</w:t>
+            </w:r>
+          </w:p>
+          <w:p>
+            <w:r>
+              <w:rPr>
+                <w:sz w:val="18"/>
+              </w:rPr>
+              <w:t xml:space="preserve">-</w:t>
+            </w:r>
+          </w:p>
+          <w:p>
+            <w:r>
+              <w:rPr>
+                <w:sz w:val="18"/>
+              </w:rPr>
+              <w:t xml:space="preserve">{%p endif %}</w:t>
             </w:r>
           </w:p>
         </w:tc>

</xml_diff>